<commit_message>
modification de la doc (quelques pétouilles)
</commit_message>
<xml_diff>
--- a/contribution directe (hydro national).docx
+++ b/contribution directe (hydro national).docx
@@ -1364,7 +1364,7 @@
               <w:rPr>
                 <w:webHidden/>
               </w:rPr>
-              <w:t>2</w:t>
+              <w:t>1</w:t>
             </w:r>
             <w:r>
               <w:rPr>
@@ -1747,28 +1747,7 @@
     </w:p>
     <w:p>
       <w:r>
-        <w:t xml:space="preserve">L’interface permet de changer des </w:t>
-      </w:r>
-      <w:r>
-        <w:t>valeurs d’</w:t>
-      </w:r>
-      <w:r>
-        <w:t xml:space="preserve">attributs </w:t>
-      </w:r>
-      <w:r>
-        <w:t xml:space="preserve">d’un ou plusieurs tronçons </w:t>
-      </w:r>
-      <w:r>
-        <w:t xml:space="preserve">sans ouvrir la table attributaire et d’envoyer les modifications sur les serveurs </w:t>
-      </w:r>
-      <w:r>
-        <w:t xml:space="preserve">BDUni </w:t>
-      </w:r>
-      <w:r>
-        <w:t>de l’IGN</w:t>
-      </w:r>
-      <w:r>
-        <w:t>.</w:t>
+        <w:t>L’interface permet de changer des valeurs d’attributs d’un ou plusieurs tronçons hydrographiques des guichets Espace collaboratif « Inventaires hydrographiques de l’Etat » et « Inventaires hydrographiques de l’Etat – FORMATION ».</w:t>
       </w:r>
     </w:p>
     <w:p/>
@@ -1891,10 +1870,10 @@
           <w:noProof/>
         </w:rPr>
         <w:drawing>
-          <wp:inline distT="0" distB="0" distL="0" distR="0" wp14:anchorId="27EE7F6B" wp14:editId="39DD18DF">
-            <wp:extent cx="3734321" cy="4639322"/>
-            <wp:effectExtent l="0" t="0" r="0" b="8890"/>
-            <wp:docPr id="3" name="Image 3"/>
+          <wp:inline distT="0" distB="0" distL="0" distR="0" wp14:anchorId="03BB8534" wp14:editId="4BF1D1BA">
+            <wp:extent cx="3733800" cy="4638675"/>
+            <wp:effectExtent l="0" t="0" r="0" b="9525"/>
+            <wp:docPr id="7" name="Image 7"/>
             <wp:cNvGraphicFramePr>
               <a:graphicFrameLocks xmlns:a="http://schemas.openxmlformats.org/drawingml/2006/main" noChangeAspect="1"/>
             </wp:cNvGraphicFramePr>
@@ -1902,17 +1881,11 @@
               <a:graphicData uri="http://schemas.openxmlformats.org/drawingml/2006/picture">
                 <pic:pic xmlns:pic="http://schemas.openxmlformats.org/drawingml/2006/picture">
                   <pic:nvPicPr>
-                    <pic:cNvPr id="3" name="Image 3"/>
+                    <pic:cNvPr id="1" name=""/>
                     <pic:cNvPicPr/>
                   </pic:nvPicPr>
                   <pic:blipFill>
-                    <a:blip r:embed="rId13">
-                      <a:extLst>
-                        <a:ext uri="{28A0092B-C50C-407E-A947-70E740481C1C}">
-                          <a14:useLocalDpi xmlns:a14="http://schemas.microsoft.com/office/drawing/2010/main" val="0"/>
-                        </a:ext>
-                      </a:extLst>
-                    </a:blip>
+                    <a:blip r:embed="rId13"/>
                     <a:stretch>
                       <a:fillRect/>
                     </a:stretch>
@@ -1920,7 +1893,7 @@
                   <pic:spPr>
                     <a:xfrm>
                       <a:off x="0" y="0"/>
-                      <a:ext cx="3734321" cy="4639322"/>
+                      <a:ext cx="3733800" cy="4638675"/>
                     </a:xfrm>
                     <a:prstGeom prst="rect">
                       <a:avLst/>
@@ -1939,6 +1912,17 @@
         <w:t>Cette interface permet de modifier certains champs des tronçons hydrographiques</w:t>
       </w:r>
     </w:p>
+    <w:p>
+      <w:r>
+        <w:t>Lorsque l’on sélectionne un tronçon hydrographique dans QGIS, les valeurs des attributs du tronçon sont surlignées en vert.</w:t>
+      </w:r>
+    </w:p>
+    <w:p>
+      <w:r>
+        <w:t>Si plusieurs tronçons sont sélectionnés seules les valeurs communes apparaissent surlignées en vert. Les valeurs qui diffèrent n’apparaissent pas.</w:t>
+      </w:r>
+    </w:p>
+    <w:p/>
     <w:p>
       <w:r>
         <w:rPr>
@@ -1987,10 +1971,13 @@
         </w:drawing>
       </w:r>
       <w:r>
+        <w:t xml:space="preserve">  </w:t>
+      </w:r>
+      <w:r>
         <w:t>Ce bouton permet d’afficher la documentation du champs correspondant (</w:t>
       </w:r>
       <w:r>
-        <w:t>bdtopoexplorer.ign.fr</w:t>
+        <w:t>https://bdtopoexplorer.ign.fr/</w:t>
       </w:r>
       <w:r>
         <w:t>)</w:t>
@@ -2049,7 +2036,7 @@
         <w:t xml:space="preserve">  </w:t>
       </w:r>
       <w:r>
-        <w:t>Ce bouton permet de sélectionner tous les tronçons compris entre un tronçon de départ et un tronçon d’arrivée.</w:t>
+        <w:t>Ce bouton permet de sélectionner tous les tronçons compris entre 2 tronçons sélectionnés (un tronçon de départ et un tronçon d’arrivée).</w:t>
       </w:r>
     </w:p>
     <w:p/>
@@ -2239,7 +2226,6 @@
       <w:bookmarkEnd w:id="8"/>
       <w:bookmarkEnd w:id="9"/>
       <w:r>
-        <w:lastRenderedPageBreak/>
         <w:t>Utilisation</w:t>
       </w:r>
       <w:bookmarkEnd w:id="10"/>
@@ -2275,7 +2261,25 @@
         <w:t xml:space="preserve"> connecté </w:t>
       </w:r>
       <w:r>
-        <w:t>à l’espace collaboratif avant l’utilisation du plugin ou juste après une validation lorsque QGIS demande de vous connecter si ce n’est pas déjà fait. Sinon les modifications seront effectives dans QGIS et non dans l’espace collaboratif.</w:t>
+        <w:t>à l’espace collaboratif avant l’utilisation du plugin ou juste après une validation lorsque QGIS demande de vous connecter si ce n’est pas déjà fait</w:t>
+      </w:r>
+      <w:r>
+        <w:t xml:space="preserve"> s</w:t>
+      </w:r>
+      <w:r>
+        <w:t xml:space="preserve">inon les modifications </w:t>
+      </w:r>
+      <w:r>
+        <w:t xml:space="preserve">ne </w:t>
+      </w:r>
+      <w:r>
+        <w:t xml:space="preserve">seront </w:t>
+      </w:r>
+      <w:r>
+        <w:t xml:space="preserve">pas </w:t>
+      </w:r>
+      <w:r>
+        <w:t>effectives dans l’espace collaboratif.</w:t>
       </w:r>
     </w:p>
     <w:p>
@@ -2659,7 +2663,15 @@
         <w:ind w:left="360"/>
       </w:pPr>
       <w:r>
-        <w:t xml:space="preserve">Pour enregistrer les modifications dans la base BDUni de l’IGN il faut cliquer sur  </w:t>
+        <w:t xml:space="preserve">Pour enregistrer les modifications dans la base </w:t>
+      </w:r>
+      <w:proofErr w:type="spellStart"/>
+      <w:r>
+        <w:t>BDUni</w:t>
+      </w:r>
+      <w:proofErr w:type="spellEnd"/>
+      <w:r>
+        <w:t xml:space="preserve"> de l’IGN il faut cliquer sur  </w:t>
       </w:r>
       <w:r>
         <w:rPr>
@@ -2782,8 +2794,12 @@
       </w:pPr>
     </w:p>
     <w:sectPr>
-      <w:footerReference w:type="default" r:id="rId24"/>
-      <w:footerReference w:type="first" r:id="rId25"/>
+      <w:headerReference w:type="even" r:id="rId24"/>
+      <w:headerReference w:type="default" r:id="rId25"/>
+      <w:footerReference w:type="even" r:id="rId26"/>
+      <w:footerReference w:type="default" r:id="rId27"/>
+      <w:headerReference w:type="first" r:id="rId28"/>
+      <w:footerReference w:type="first" r:id="rId29"/>
       <w:pgSz w:w="11906" w:h="16838" w:code="9"/>
       <w:pgMar w:top="851" w:right="924" w:bottom="1616" w:left="1134" w:header="709" w:footer="607" w:gutter="0"/>
       <w:cols w:space="708"/>
@@ -2813,6 +2829,16 @@
 </file>
 
 <file path=word/footer1.xml><?xml version="1.0" encoding="utf-8"?>
+<w:ftr xmlns:wpc="http://schemas.microsoft.com/office/word/2010/wordprocessingCanvas" xmlns:cx="http://schemas.microsoft.com/office/drawing/2014/chartex" xmlns:cx1="http://schemas.microsoft.com/office/drawing/2015/9/8/chartex" xmlns:cx2="http://schemas.microsoft.com/office/drawing/2015/10/21/chartex" xmlns:cx3="http://schemas.microsoft.com/office/drawing/2016/5/9/chartex" xmlns:cx4="http://schemas.microsoft.com/office/drawing/2016/5/10/chartex" xmlns:cx5="http://schemas.microsoft.com/office/drawing/2016/5/11/chartex" xmlns:cx6="http://schemas.microsoft.com/office/drawing/2016/5/12/chartex" xmlns:cx7="http://schemas.microsoft.com/office/drawing/2016/5/13/chartex" xmlns:cx8="http://schemas.microsoft.com/office/drawing/2016/5/14/chartex" xmlns:mc="http://schemas.openxmlformats.org/markup-compatibility/2006" xmlns:aink="http://schemas.microsoft.com/office/drawing/2016/ink" xmlns:am3d="http://schemas.microsoft.com/office/drawing/2017/model3d" xmlns:o="urn:schemas-microsoft-com:office:office" xmlns:r="http://schemas.openxmlformats.org/officeDocument/2006/relationships" xmlns:m="http://schemas.openxmlformats.org/officeDocument/2006/math" xmlns:v="urn:schemas-microsoft-com:vml" xmlns:wp14="http://schemas.microsoft.com/office/word/2010/wordprocessingDrawing" xmlns:wp="http://schemas.openxmlformats.org/drawingml/2006/wordprocessingDrawing" xmlns:w10="urn:schemas-microsoft-com:office:word" xmlns:w="http://schemas.openxmlformats.org/wordprocessingml/2006/main" xmlns:w14="http://schemas.microsoft.com/office/word/2010/wordml" xmlns:w15="http://schemas.microsoft.com/office/word/2012/wordml" xmlns:w16cex="http://schemas.microsoft.com/office/word/2018/wordml/cex" xmlns:w16cid="http://schemas.microsoft.com/office/word/2016/wordml/cid" xmlns:w16="http://schemas.microsoft.com/office/word/2018/wordml" xmlns:w16sdtdh="http://schemas.microsoft.com/office/word/2020/wordml/sdtdatahash" xmlns:w16se="http://schemas.microsoft.com/office/word/2015/wordml/symex" xmlns:wpg="http://schemas.microsoft.com/office/word/2010/wordprocessingGroup" xmlns:wpi="http://schemas.microsoft.com/office/word/2010/wordprocessingInk" xmlns:wne="http://schemas.microsoft.com/office/word/2006/wordml" xmlns:wps="http://schemas.microsoft.com/office/word/2010/wordprocessingShape" mc:Ignorable="w14 w15 w16se w16cid w16 w16cex w16sdtdh wp14">
+  <w:p>
+    <w:pPr>
+      <w:pStyle w:val="Pieddepage"/>
+    </w:pPr>
+  </w:p>
+</w:ftr>
+</file>
+
+<file path=word/footer2.xml><?xml version="1.0" encoding="utf-8"?>
 <w:ftr xmlns:wpc="http://schemas.microsoft.com/office/word/2010/wordprocessingCanvas" xmlns:cx="http://schemas.microsoft.com/office/drawing/2014/chartex" xmlns:cx1="http://schemas.microsoft.com/office/drawing/2015/9/8/chartex" xmlns:cx2="http://schemas.microsoft.com/office/drawing/2015/10/21/chartex" xmlns:cx3="http://schemas.microsoft.com/office/drawing/2016/5/9/chartex" xmlns:cx4="http://schemas.microsoft.com/office/drawing/2016/5/10/chartex" xmlns:cx5="http://schemas.microsoft.com/office/drawing/2016/5/11/chartex" xmlns:cx6="http://schemas.microsoft.com/office/drawing/2016/5/12/chartex" xmlns:cx7="http://schemas.microsoft.com/office/drawing/2016/5/13/chartex" xmlns:cx8="http://schemas.microsoft.com/office/drawing/2016/5/14/chartex" xmlns:mc="http://schemas.openxmlformats.org/markup-compatibility/2006" xmlns:aink="http://schemas.microsoft.com/office/drawing/2016/ink" xmlns:am3d="http://schemas.microsoft.com/office/drawing/2017/model3d" xmlns:o="urn:schemas-microsoft-com:office:office" xmlns:r="http://schemas.openxmlformats.org/officeDocument/2006/relationships" xmlns:m="http://schemas.openxmlformats.org/officeDocument/2006/math" xmlns:v="urn:schemas-microsoft-com:vml" xmlns:wp14="http://schemas.microsoft.com/office/word/2010/wordprocessingDrawing" xmlns:wp="http://schemas.openxmlformats.org/drawingml/2006/wordprocessingDrawing" xmlns:w10="urn:schemas-microsoft-com:office:word" xmlns:w="http://schemas.openxmlformats.org/wordprocessingml/2006/main" xmlns:w14="http://schemas.microsoft.com/office/word/2010/wordml" xmlns:w15="http://schemas.microsoft.com/office/word/2012/wordml" xmlns:w16cex="http://schemas.microsoft.com/office/word/2018/wordml/cex" xmlns:w16cid="http://schemas.microsoft.com/office/word/2016/wordml/cid" xmlns:w16="http://schemas.microsoft.com/office/word/2018/wordml" xmlns:w16sdtdh="http://schemas.microsoft.com/office/word/2020/wordml/sdtdatahash" xmlns:w16se="http://schemas.microsoft.com/office/word/2015/wordml/symex" xmlns:wpg="http://schemas.microsoft.com/office/word/2010/wordprocessingGroup" xmlns:wpi="http://schemas.microsoft.com/office/word/2010/wordprocessingInk" xmlns:wne="http://schemas.microsoft.com/office/word/2006/wordml" xmlns:wps="http://schemas.microsoft.com/office/word/2010/wordprocessingShape" mc:Ignorable="w14 w15 w16se w16cid w16 w16cex w16sdtdh wp14">
   <w:tbl>
     <w:tblPr>
@@ -3017,7 +3043,7 @@
             <w:tag w:val="_DCDateCreated"/>
             <w:id w:val="317545533"/>
             <w:dataBinding w:prefixMappings="xmlns:ns0='http://schemas.microsoft.com/office/2006/metadata/properties' xmlns:ns1='http://www.w3.org/2001/XMLSchema-instance' xmlns:ns2='http://schemas.microsoft.com/office/infopath/2007/PartnerControls' xmlns:ns3='a1322699-2fbb-4cce-8aba-176c4fa97253' xmlns:ns4='http://schemas.microsoft.com/sharepoint/v3' xmlns:ns5='http://schemas.microsoft.com/sharepoint/v3/fields' xmlns:ns6='f0ff482e-aa3b-417e-9d65-5f4cb2656651' " w:xpath="/ns0:properties[1]/documentManagement[1]/ns5:_DCDateCreated[1]" w:storeItemID="{1159403A-C237-488E-8C5E-DABF9FCE7043}"/>
-            <w:date w:fullDate="2025-07-25T00:00:00Z">
+            <w:date w:fullDate="2025-08-25T00:00:00Z">
               <w:dateFormat w:val="dd/MM/yyyy"/>
               <w:lid w:val="fr-FR"/>
               <w:storeMappedDataAs w:val="dateTime"/>
@@ -3081,7 +3107,7 @@
                   <w:sz w:val="16"/>
                   <w:szCs w:val="16"/>
                 </w:rPr>
-                <w:t>7</w:t>
+                <w:t>8</w:t>
               </w:r>
               <w:r>
                 <w:rPr>
@@ -3262,7 +3288,7 @@
 </w:ftr>
 </file>
 
-<file path=word/footer2.xml><?xml version="1.0" encoding="utf-8"?>
+<file path=word/footer3.xml><?xml version="1.0" encoding="utf-8"?>
 <w:ftr xmlns:wpc="http://schemas.microsoft.com/office/word/2010/wordprocessingCanvas" xmlns:cx="http://schemas.microsoft.com/office/drawing/2014/chartex" xmlns:cx1="http://schemas.microsoft.com/office/drawing/2015/9/8/chartex" xmlns:cx2="http://schemas.microsoft.com/office/drawing/2015/10/21/chartex" xmlns:cx3="http://schemas.microsoft.com/office/drawing/2016/5/9/chartex" xmlns:cx4="http://schemas.microsoft.com/office/drawing/2016/5/10/chartex" xmlns:cx5="http://schemas.microsoft.com/office/drawing/2016/5/11/chartex" xmlns:cx6="http://schemas.microsoft.com/office/drawing/2016/5/12/chartex" xmlns:cx7="http://schemas.microsoft.com/office/drawing/2016/5/13/chartex" xmlns:cx8="http://schemas.microsoft.com/office/drawing/2016/5/14/chartex" xmlns:mc="http://schemas.openxmlformats.org/markup-compatibility/2006" xmlns:aink="http://schemas.microsoft.com/office/drawing/2016/ink" xmlns:am3d="http://schemas.microsoft.com/office/drawing/2017/model3d" xmlns:o="urn:schemas-microsoft-com:office:office" xmlns:r="http://schemas.openxmlformats.org/officeDocument/2006/relationships" xmlns:m="http://schemas.openxmlformats.org/officeDocument/2006/math" xmlns:v="urn:schemas-microsoft-com:vml" xmlns:wp14="http://schemas.microsoft.com/office/word/2010/wordprocessingDrawing" xmlns:wp="http://schemas.openxmlformats.org/drawingml/2006/wordprocessingDrawing" xmlns:w10="urn:schemas-microsoft-com:office:word" xmlns:w="http://schemas.openxmlformats.org/wordprocessingml/2006/main" xmlns:w14="http://schemas.microsoft.com/office/word/2010/wordml" xmlns:w15="http://schemas.microsoft.com/office/word/2012/wordml" xmlns:w16cex="http://schemas.microsoft.com/office/word/2018/wordml/cex" xmlns:w16cid="http://schemas.microsoft.com/office/word/2016/wordml/cid" xmlns:w16="http://schemas.microsoft.com/office/word/2018/wordml" xmlns:w16sdtdh="http://schemas.microsoft.com/office/word/2020/wordml/sdtdatahash" xmlns:w16se="http://schemas.microsoft.com/office/word/2015/wordml/symex" xmlns:wpg="http://schemas.microsoft.com/office/word/2010/wordprocessingGroup" xmlns:wpi="http://schemas.microsoft.com/office/word/2010/wordprocessingInk" xmlns:wne="http://schemas.microsoft.com/office/word/2006/wordml" xmlns:wps="http://schemas.microsoft.com/office/word/2010/wordprocessingShape" mc:Ignorable="w14 w15 w16se w16cid w16 w16cex w16sdtdh wp14">
   <w:p>
     <w:pPr>
@@ -3329,6 +3355,36 @@
 </w:footnotes>
 </file>
 
+<file path=word/header1.xml><?xml version="1.0" encoding="utf-8"?>
+<w:hdr xmlns:wpc="http://schemas.microsoft.com/office/word/2010/wordprocessingCanvas" xmlns:cx="http://schemas.microsoft.com/office/drawing/2014/chartex" xmlns:cx1="http://schemas.microsoft.com/office/drawing/2015/9/8/chartex" xmlns:cx2="http://schemas.microsoft.com/office/drawing/2015/10/21/chartex" xmlns:cx3="http://schemas.microsoft.com/office/drawing/2016/5/9/chartex" xmlns:cx4="http://schemas.microsoft.com/office/drawing/2016/5/10/chartex" xmlns:cx5="http://schemas.microsoft.com/office/drawing/2016/5/11/chartex" xmlns:cx6="http://schemas.microsoft.com/office/drawing/2016/5/12/chartex" xmlns:cx7="http://schemas.microsoft.com/office/drawing/2016/5/13/chartex" xmlns:cx8="http://schemas.microsoft.com/office/drawing/2016/5/14/chartex" xmlns:mc="http://schemas.openxmlformats.org/markup-compatibility/2006" xmlns:aink="http://schemas.microsoft.com/office/drawing/2016/ink" xmlns:am3d="http://schemas.microsoft.com/office/drawing/2017/model3d" xmlns:o="urn:schemas-microsoft-com:office:office" xmlns:r="http://schemas.openxmlformats.org/officeDocument/2006/relationships" xmlns:m="http://schemas.openxmlformats.org/officeDocument/2006/math" xmlns:v="urn:schemas-microsoft-com:vml" xmlns:wp14="http://schemas.microsoft.com/office/word/2010/wordprocessingDrawing" xmlns:wp="http://schemas.openxmlformats.org/drawingml/2006/wordprocessingDrawing" xmlns:w10="urn:schemas-microsoft-com:office:word" xmlns:w="http://schemas.openxmlformats.org/wordprocessingml/2006/main" xmlns:w14="http://schemas.microsoft.com/office/word/2010/wordml" xmlns:w15="http://schemas.microsoft.com/office/word/2012/wordml" xmlns:w16cex="http://schemas.microsoft.com/office/word/2018/wordml/cex" xmlns:w16cid="http://schemas.microsoft.com/office/word/2016/wordml/cid" xmlns:w16="http://schemas.microsoft.com/office/word/2018/wordml" xmlns:w16sdtdh="http://schemas.microsoft.com/office/word/2020/wordml/sdtdatahash" xmlns:w16se="http://schemas.microsoft.com/office/word/2015/wordml/symex" xmlns:wpg="http://schemas.microsoft.com/office/word/2010/wordprocessingGroup" xmlns:wpi="http://schemas.microsoft.com/office/word/2010/wordprocessingInk" xmlns:wne="http://schemas.microsoft.com/office/word/2006/wordml" xmlns:wps="http://schemas.microsoft.com/office/word/2010/wordprocessingShape" mc:Ignorable="w14 w15 w16se w16cid w16 w16cex w16sdtdh wp14">
+  <w:p>
+    <w:pPr>
+      <w:pStyle w:val="En-tte"/>
+    </w:pPr>
+  </w:p>
+</w:hdr>
+</file>
+
+<file path=word/header2.xml><?xml version="1.0" encoding="utf-8"?>
+<w:hdr xmlns:wpc="http://schemas.microsoft.com/office/word/2010/wordprocessingCanvas" xmlns:cx="http://schemas.microsoft.com/office/drawing/2014/chartex" xmlns:cx1="http://schemas.microsoft.com/office/drawing/2015/9/8/chartex" xmlns:cx2="http://schemas.microsoft.com/office/drawing/2015/10/21/chartex" xmlns:cx3="http://schemas.microsoft.com/office/drawing/2016/5/9/chartex" xmlns:cx4="http://schemas.microsoft.com/office/drawing/2016/5/10/chartex" xmlns:cx5="http://schemas.microsoft.com/office/drawing/2016/5/11/chartex" xmlns:cx6="http://schemas.microsoft.com/office/drawing/2016/5/12/chartex" xmlns:cx7="http://schemas.microsoft.com/office/drawing/2016/5/13/chartex" xmlns:cx8="http://schemas.microsoft.com/office/drawing/2016/5/14/chartex" xmlns:mc="http://schemas.openxmlformats.org/markup-compatibility/2006" xmlns:aink="http://schemas.microsoft.com/office/drawing/2016/ink" xmlns:am3d="http://schemas.microsoft.com/office/drawing/2017/model3d" xmlns:o="urn:schemas-microsoft-com:office:office" xmlns:r="http://schemas.openxmlformats.org/officeDocument/2006/relationships" xmlns:m="http://schemas.openxmlformats.org/officeDocument/2006/math" xmlns:v="urn:schemas-microsoft-com:vml" xmlns:wp14="http://schemas.microsoft.com/office/word/2010/wordprocessingDrawing" xmlns:wp="http://schemas.openxmlformats.org/drawingml/2006/wordprocessingDrawing" xmlns:w10="urn:schemas-microsoft-com:office:word" xmlns:w="http://schemas.openxmlformats.org/wordprocessingml/2006/main" xmlns:w14="http://schemas.microsoft.com/office/word/2010/wordml" xmlns:w15="http://schemas.microsoft.com/office/word/2012/wordml" xmlns:w16cex="http://schemas.microsoft.com/office/word/2018/wordml/cex" xmlns:w16cid="http://schemas.microsoft.com/office/word/2016/wordml/cid" xmlns:w16="http://schemas.microsoft.com/office/word/2018/wordml" xmlns:w16sdtdh="http://schemas.microsoft.com/office/word/2020/wordml/sdtdatahash" xmlns:w16se="http://schemas.microsoft.com/office/word/2015/wordml/symex" xmlns:wpg="http://schemas.microsoft.com/office/word/2010/wordprocessingGroup" xmlns:wpi="http://schemas.microsoft.com/office/word/2010/wordprocessingInk" xmlns:wne="http://schemas.microsoft.com/office/word/2006/wordml" xmlns:wps="http://schemas.microsoft.com/office/word/2010/wordprocessingShape" mc:Ignorable="w14 w15 w16se w16cid w16 w16cex w16sdtdh wp14">
+  <w:p>
+    <w:pPr>
+      <w:pStyle w:val="En-tte"/>
+    </w:pPr>
+  </w:p>
+</w:hdr>
+</file>
+
+<file path=word/header3.xml><?xml version="1.0" encoding="utf-8"?>
+<w:hdr xmlns:wpc="http://schemas.microsoft.com/office/word/2010/wordprocessingCanvas" xmlns:cx="http://schemas.microsoft.com/office/drawing/2014/chartex" xmlns:cx1="http://schemas.microsoft.com/office/drawing/2015/9/8/chartex" xmlns:cx2="http://schemas.microsoft.com/office/drawing/2015/10/21/chartex" xmlns:cx3="http://schemas.microsoft.com/office/drawing/2016/5/9/chartex" xmlns:cx4="http://schemas.microsoft.com/office/drawing/2016/5/10/chartex" xmlns:cx5="http://schemas.microsoft.com/office/drawing/2016/5/11/chartex" xmlns:cx6="http://schemas.microsoft.com/office/drawing/2016/5/12/chartex" xmlns:cx7="http://schemas.microsoft.com/office/drawing/2016/5/13/chartex" xmlns:cx8="http://schemas.microsoft.com/office/drawing/2016/5/14/chartex" xmlns:mc="http://schemas.openxmlformats.org/markup-compatibility/2006" xmlns:aink="http://schemas.microsoft.com/office/drawing/2016/ink" xmlns:am3d="http://schemas.microsoft.com/office/drawing/2017/model3d" xmlns:o="urn:schemas-microsoft-com:office:office" xmlns:r="http://schemas.openxmlformats.org/officeDocument/2006/relationships" xmlns:m="http://schemas.openxmlformats.org/officeDocument/2006/math" xmlns:v="urn:schemas-microsoft-com:vml" xmlns:wp14="http://schemas.microsoft.com/office/word/2010/wordprocessingDrawing" xmlns:wp="http://schemas.openxmlformats.org/drawingml/2006/wordprocessingDrawing" xmlns:w10="urn:schemas-microsoft-com:office:word" xmlns:w="http://schemas.openxmlformats.org/wordprocessingml/2006/main" xmlns:w14="http://schemas.microsoft.com/office/word/2010/wordml" xmlns:w15="http://schemas.microsoft.com/office/word/2012/wordml" xmlns:w16cex="http://schemas.microsoft.com/office/word/2018/wordml/cex" xmlns:w16cid="http://schemas.microsoft.com/office/word/2016/wordml/cid" xmlns:w16="http://schemas.microsoft.com/office/word/2018/wordml" xmlns:w16sdtdh="http://schemas.microsoft.com/office/word/2020/wordml/sdtdatahash" xmlns:w16se="http://schemas.microsoft.com/office/word/2015/wordml/symex" xmlns:wpg="http://schemas.microsoft.com/office/word/2010/wordprocessingGroup" xmlns:wpi="http://schemas.microsoft.com/office/word/2010/wordprocessingInk" xmlns:wne="http://schemas.microsoft.com/office/word/2006/wordml" xmlns:wps="http://schemas.microsoft.com/office/word/2010/wordprocessingShape" mc:Ignorable="w14 w15 w16se w16cid w16 w16cex w16sdtdh wp14">
+  <w:p>
+    <w:pPr>
+      <w:pStyle w:val="En-tte"/>
+    </w:pPr>
+  </w:p>
+</w:hdr>
+</file>
+
 <file path=word/numbering.xml><?xml version="1.0" encoding="utf-8"?>
 <w:numbering xmlns:wpc="http://schemas.microsoft.com/office/word/2010/wordprocessingCanvas" xmlns:cx="http://schemas.microsoft.com/office/drawing/2014/chartex" xmlns:cx1="http://schemas.microsoft.com/office/drawing/2015/9/8/chartex" xmlns:cx2="http://schemas.microsoft.com/office/drawing/2015/10/21/chartex" xmlns:cx3="http://schemas.microsoft.com/office/drawing/2016/5/9/chartex" xmlns:cx4="http://schemas.microsoft.com/office/drawing/2016/5/10/chartex" xmlns:cx5="http://schemas.microsoft.com/office/drawing/2016/5/11/chartex" xmlns:cx6="http://schemas.microsoft.com/office/drawing/2016/5/12/chartex" xmlns:cx7="http://schemas.microsoft.com/office/drawing/2016/5/13/chartex" xmlns:cx8="http://schemas.microsoft.com/office/drawing/2016/5/14/chartex" xmlns:mc="http://schemas.openxmlformats.org/markup-compatibility/2006" xmlns:aink="http://schemas.microsoft.com/office/drawing/2016/ink" xmlns:am3d="http://schemas.microsoft.com/office/drawing/2017/model3d" xmlns:o="urn:schemas-microsoft-com:office:office" xmlns:r="http://schemas.openxmlformats.org/officeDocument/2006/relationships" xmlns:m="http://schemas.openxmlformats.org/officeDocument/2006/math" xmlns:v="urn:schemas-microsoft-com:vml" xmlns:wp14="http://schemas.microsoft.com/office/word/2010/wordprocessingDrawing" xmlns:wp="http://schemas.openxmlformats.org/drawingml/2006/wordprocessingDrawing" xmlns:w10="urn:schemas-microsoft-com:office:word" xmlns:w="http://schemas.openxmlformats.org/wordprocessingml/2006/main" xmlns:w14="http://schemas.microsoft.com/office/word/2010/wordml" xmlns:w15="http://schemas.microsoft.com/office/word/2012/wordml" xmlns:w16cex="http://schemas.microsoft.com/office/word/2018/wordml/cex" xmlns:w16cid="http://schemas.microsoft.com/office/word/2016/wordml/cid" xmlns:w16="http://schemas.microsoft.com/office/word/2018/wordml" xmlns:w16sdtdh="http://schemas.microsoft.com/office/word/2020/wordml/sdtdatahash" xmlns:w16se="http://schemas.microsoft.com/office/word/2015/wordml/symex" xmlns:wpg="http://schemas.microsoft.com/office/word/2010/wordprocessingGroup" xmlns:wpi="http://schemas.microsoft.com/office/word/2010/wordprocessingInk" xmlns:wne="http://schemas.microsoft.com/office/word/2006/wordml" xmlns:wps="http://schemas.microsoft.com/office/word/2010/wordprocessingShape" mc:Ignorable="w14 w15 w16se w16cid w16 w16cex w16sdtdh wp14">
   <w:numPicBullet w:numPicBulletId="0">
@@ -3352,7 +3408,7 @@
         <v:path o:extrusionok="f" gradientshapeok="t" o:connecttype="rect"/>
         <o:lock v:ext="edit" aspectratio="t"/>
       </v:shapetype>
-      <v:shape id="_x0000_i1067" type="#_x0000_t75" style="width:30.75pt;height:52.5pt" o:bullet="t">
+      <v:shape id="_x0000_i1086" type="#_x0000_t75" style="width:30.75pt;height:52.35pt" o:bullet="t">
         <v:imagedata r:id="rId1" o:title="puce"/>
       </v:shape>
     </w:pict>
@@ -8203,14 +8259,14 @@
     <w:charset w:val="00"/>
     <w:family w:val="roman"/>
     <w:pitch w:val="variable"/>
-    <w:sig w:usb0="E0002AFF" w:usb1="C0007843" w:usb2="00000009" w:usb3="00000000" w:csb0="000001FF" w:csb1="00000000"/>
+    <w:sig w:usb0="E0002EFF" w:usb1="C000785B" w:usb2="00000009" w:usb3="00000000" w:csb0="000001FF" w:csb1="00000000"/>
   </w:font>
   <w:font w:name="Arial">
     <w:panose1 w:val="020B0604020202020204"/>
     <w:charset w:val="00"/>
     <w:family w:val="swiss"/>
     <w:pitch w:val="variable"/>
-    <w:sig w:usb0="E0002AFF" w:usb1="C0007843" w:usb2="00000009" w:usb3="00000000" w:csb0="000001FF" w:csb1="00000000"/>
+    <w:sig w:usb0="E0002EFF" w:usb1="C000785B" w:usb2="00000009" w:usb3="00000000" w:csb0="000001FF" w:csb1="00000000"/>
   </w:font>
   <w:font w:name="Wingdings">
     <w:panose1 w:val="05000000000000000000"/>
@@ -8231,7 +8287,7 @@
     <w:charset w:val="00"/>
     <w:family w:val="swiss"/>
     <w:pitch w:val="variable"/>
-    <w:sig w:usb0="E0002AFF" w:usb1="4000ACFF" w:usb2="00000001" w:usb3="00000000" w:csb0="000001FF" w:csb1="00000000"/>
+    <w:sig w:usb0="E4002EFF" w:usb1="C000247B" w:usb2="00000009" w:usb3="00000000" w:csb0="000001FF" w:csb1="00000000"/>
   </w:font>
   <w:font w:name="Tahoma">
     <w:panose1 w:val="020B0604030504040204"/>
@@ -8259,7 +8315,7 @@
     <w:charset w:val="00"/>
     <w:family w:val="swiss"/>
     <w:pitch w:val="variable"/>
-    <w:sig w:usb0="A00002EF" w:usb1="4000207B" w:usb2="00000000" w:usb3="00000000" w:csb0="0000009F" w:csb1="00000000"/>
+    <w:sig w:usb0="E4002EFF" w:usb1="C000247B" w:usb2="00000009" w:usb3="00000000" w:csb0="000001FF" w:csb1="00000000"/>
   </w:font>
 </w:fonts>
 </file>
@@ -8281,10 +8337,12 @@
   <w:rsids>
     <w:rsidRoot w:val="00CA38A7"/>
     <w:rsid w:val="00065F3B"/>
+    <w:rsid w:val="000A513E"/>
     <w:rsid w:val="000B22EE"/>
     <w:rsid w:val="000D4DEE"/>
     <w:rsid w:val="00162DC9"/>
     <w:rsid w:val="003259A4"/>
+    <w:rsid w:val="0032743B"/>
     <w:rsid w:val="00515A60"/>
     <w:rsid w:val="0054019A"/>
     <w:rsid w:val="00596E3A"/>
@@ -8302,6 +8360,7 @@
     <w:rsid w:val="00AD733F"/>
     <w:rsid w:val="00B82D9E"/>
     <w:rsid w:val="00BB4FFB"/>
+    <w:rsid w:val="00BC2E30"/>
     <w:rsid w:val="00C13EA8"/>
     <w:rsid w:val="00C2639B"/>
     <w:rsid w:val="00CA1D17"/>
@@ -9256,13 +9315,7 @@
 </file>
 
 <file path=customXml/item2.xml><?xml version="1.0" encoding="utf-8"?>
-<p:properties xmlns:p="http://schemas.microsoft.com/office/2006/metadata/properties" xmlns:xsi="http://www.w3.org/2001/XMLSchema-instance" xmlns:pc="http://schemas.microsoft.com/office/infopath/2007/PartnerControls">
-  <documentManagement>
-    <lcf76f155ced4ddcb4097134ff3c332f xmlns="b295003c-aa87-407e-9024-fdee4e88f6fa">
-      <Terms xmlns="http://schemas.microsoft.com/office/infopath/2007/PartnerControls"/>
-    </lcf76f155ced4ddcb4097134ff3c332f>
-  </documentManagement>
-</p:properties>
+<b:Sources xmlns:b="http://schemas.openxmlformats.org/officeDocument/2006/bibliography" xmlns="http://schemas.openxmlformats.org/officeDocument/2006/bibliography" SelectedStyle="\APA.XSL" StyleName="APA"/>
 </file>
 
 <file path=customXml/item3.xml><?xml version="1.0" encoding="utf-8"?>
@@ -9275,7 +9328,13 @@
 </file>
 
 <file path=customXml/item4.xml><?xml version="1.0" encoding="utf-8"?>
-<b:Sources xmlns:b="http://schemas.openxmlformats.org/officeDocument/2006/bibliography" xmlns="http://schemas.openxmlformats.org/officeDocument/2006/bibliography" SelectedStyle="\APA.XSL" StyleName="APA"/>
+<p:properties xmlns:p="http://schemas.microsoft.com/office/2006/metadata/properties" xmlns:xsi="http://www.w3.org/2001/XMLSchema-instance" xmlns:pc="http://schemas.microsoft.com/office/infopath/2007/PartnerControls">
+  <documentManagement>
+    <lcf76f155ced4ddcb4097134ff3c332f xmlns="b295003c-aa87-407e-9024-fdee4e88f6fa">
+      <Terms xmlns="http://schemas.microsoft.com/office/infopath/2007/PartnerControls"/>
+    </lcf76f155ced4ddcb4097134ff3c332f>
+  </documentManagement>
+</p:properties>
 </file>
 
 <file path=customXml/itemProps1.xml><?xml version="1.0" encoding="utf-8"?>
@@ -9297,11 +9356,9 @@
 </file>
 
 <file path=customXml/itemProps2.xml><?xml version="1.0" encoding="utf-8"?>
-<ds:datastoreItem xmlns:ds="http://schemas.openxmlformats.org/officeDocument/2006/customXml" ds:itemID="{1159403A-C237-488E-8C5E-DABF9FCE7043}">
+<ds:datastoreItem xmlns:ds="http://schemas.openxmlformats.org/officeDocument/2006/customXml" ds:itemID="{0FF0F878-5F0F-460C-9013-40E72731A637}">
   <ds:schemaRefs>
-    <ds:schemaRef ds:uri="http://schemas.microsoft.com/office/2006/metadata/properties"/>
-    <ds:schemaRef ds:uri="http://schemas.microsoft.com/office/infopath/2007/PartnerControls"/>
-    <ds:schemaRef ds:uri="b295003c-aa87-407e-9024-fdee4e88f6fa"/>
+    <ds:schemaRef ds:uri="http://schemas.openxmlformats.org/officeDocument/2006/bibliography"/>
   </ds:schemaRefs>
 </ds:datastoreItem>
 </file>
@@ -9315,9 +9372,11 @@
 </file>
 
 <file path=customXml/itemProps4.xml><?xml version="1.0" encoding="utf-8"?>
-<ds:datastoreItem xmlns:ds="http://schemas.openxmlformats.org/officeDocument/2006/customXml" ds:itemID="{0FF0F878-5F0F-460C-9013-40E72731A637}">
+<ds:datastoreItem xmlns:ds="http://schemas.openxmlformats.org/officeDocument/2006/customXml" ds:itemID="{1159403A-C237-488E-8C5E-DABF9FCE7043}">
   <ds:schemaRefs>
-    <ds:schemaRef ds:uri="http://schemas.openxmlformats.org/officeDocument/2006/bibliography"/>
+    <ds:schemaRef ds:uri="http://schemas.microsoft.com/office/2006/metadata/properties"/>
+    <ds:schemaRef ds:uri="http://schemas.microsoft.com/office/infopath/2007/PartnerControls"/>
+    <ds:schemaRef ds:uri="b295003c-aa87-407e-9024-fdee4e88f6fa"/>
   </ds:schemaRefs>
 </ds:datastoreItem>
 </file>
</xml_diff>

<commit_message>
modification de la doc - issue 2
</commit_message>
<xml_diff>
--- a/contribution directe (hydro national).docx
+++ b/contribution directe (hydro national).docx
@@ -1309,7 +1309,7 @@
           <w:r>
             <w:fldChar w:fldCharType="separate"/>
           </w:r>
-          <w:hyperlink w:anchor="_Toc161956522" w:history="1">
+          <w:hyperlink w:anchor="_Toc212728909" w:history="1">
             <w:r>
               <w:rPr>
                 <w:rStyle w:val="Lienhypertexte"/>
@@ -1347,7 +1347,7 @@
               <w:rPr>
                 <w:webHidden/>
               </w:rPr>
-              <w:instrText xml:space="preserve"> PAGEREF _Toc161956522 \h </w:instrText>
+              <w:instrText xml:space="preserve"> PAGEREF _Toc212728909 \h </w:instrText>
             </w:r>
             <w:r>
               <w:rPr>
@@ -1364,7 +1364,7 @@
               <w:rPr>
                 <w:webHidden/>
               </w:rPr>
-              <w:t>1</w:t>
+              <w:t>2</w:t>
             </w:r>
             <w:r>
               <w:rPr>
@@ -1384,7 +1384,7 @@
               <w:szCs w:val="22"/>
             </w:rPr>
           </w:pPr>
-          <w:hyperlink w:anchor="_Toc161956523" w:history="1">
+          <w:hyperlink w:anchor="_Toc212728910" w:history="1">
             <w:r>
               <w:rPr>
                 <w:rStyle w:val="Lienhypertexte"/>
@@ -1422,7 +1422,7 @@
               <w:rPr>
                 <w:webHidden/>
               </w:rPr>
-              <w:instrText xml:space="preserve"> PAGEREF _Toc161956523 \h </w:instrText>
+              <w:instrText xml:space="preserve"> PAGEREF _Toc212728910 \h </w:instrText>
             </w:r>
             <w:r>
               <w:rPr>
@@ -1459,7 +1459,7 @@
               <w:szCs w:val="22"/>
             </w:rPr>
           </w:pPr>
-          <w:hyperlink w:anchor="_Toc161956524" w:history="1">
+          <w:hyperlink w:anchor="_Toc212728911" w:history="1">
             <w:r>
               <w:rPr>
                 <w:rStyle w:val="Lienhypertexte"/>
@@ -1497,7 +1497,7 @@
               <w:rPr>
                 <w:webHidden/>
               </w:rPr>
-              <w:instrText xml:space="preserve"> PAGEREF _Toc161956524 \h </w:instrText>
+              <w:instrText xml:space="preserve"> PAGEREF _Toc212728911 \h </w:instrText>
             </w:r>
             <w:r>
               <w:rPr>
@@ -1534,7 +1534,7 @@
               <w:szCs w:val="22"/>
             </w:rPr>
           </w:pPr>
-          <w:hyperlink w:anchor="_Toc161956525" w:history="1">
+          <w:hyperlink w:anchor="_Toc212728912" w:history="1">
             <w:r>
               <w:rPr>
                 <w:rStyle w:val="Lienhypertexte"/>
@@ -1572,7 +1572,7 @@
               <w:rPr>
                 <w:webHidden/>
               </w:rPr>
-              <w:instrText xml:space="preserve"> PAGEREF _Toc161956525 \h </w:instrText>
+              <w:instrText xml:space="preserve"> PAGEREF _Toc212728912 \h </w:instrText>
             </w:r>
             <w:r>
               <w:rPr>
@@ -1609,7 +1609,7 @@
               <w:szCs w:val="22"/>
             </w:rPr>
           </w:pPr>
-          <w:hyperlink w:anchor="_Toc161956526" w:history="1">
+          <w:hyperlink w:anchor="_Toc212728913" w:history="1">
             <w:r>
               <w:rPr>
                 <w:rStyle w:val="Lienhypertexte"/>
@@ -1647,7 +1647,82 @@
               <w:rPr>
                 <w:webHidden/>
               </w:rPr>
-              <w:instrText xml:space="preserve"> PAGEREF _Toc161956526 \h </w:instrText>
+              <w:instrText xml:space="preserve"> PAGEREF _Toc212728913 \h </w:instrText>
+            </w:r>
+            <w:r>
+              <w:rPr>
+                <w:webHidden/>
+              </w:rPr>
+            </w:r>
+            <w:r>
+              <w:rPr>
+                <w:webHidden/>
+              </w:rPr>
+              <w:fldChar w:fldCharType="separate"/>
+            </w:r>
+            <w:r>
+              <w:rPr>
+                <w:webHidden/>
+              </w:rPr>
+              <w:t>4</w:t>
+            </w:r>
+            <w:r>
+              <w:rPr>
+                <w:webHidden/>
+              </w:rPr>
+              <w:fldChar w:fldCharType="end"/>
+            </w:r>
+          </w:hyperlink>
+        </w:p>
+        <w:p>
+          <w:pPr>
+            <w:pStyle w:val="TM1"/>
+            <w:rPr>
+              <w:rFonts w:asciiTheme="minorHAnsi" w:eastAsiaTheme="minorEastAsia" w:hAnsiTheme="minorHAnsi" w:cstheme="minorBidi"/>
+              <w:smallCaps w:val="0"/>
+              <w:sz w:val="22"/>
+              <w:szCs w:val="22"/>
+            </w:rPr>
+          </w:pPr>
+          <w:hyperlink w:anchor="_Toc212728914" w:history="1">
+            <w:r>
+              <w:rPr>
+                <w:rStyle w:val="Lienhypertexte"/>
+              </w:rPr>
+              <w:t>6</w:t>
+            </w:r>
+            <w:r>
+              <w:rPr>
+                <w:rFonts w:asciiTheme="minorHAnsi" w:eastAsiaTheme="minorEastAsia" w:hAnsiTheme="minorHAnsi" w:cstheme="minorBidi"/>
+                <w:smallCaps w:val="0"/>
+                <w:sz w:val="22"/>
+                <w:szCs w:val="22"/>
+              </w:rPr>
+              <w:tab/>
+            </w:r>
+            <w:r>
+              <w:rPr>
+                <w:rStyle w:val="Lienhypertexte"/>
+              </w:rPr>
+              <w:t>Exemple de manipulation : je veux modifier la nature d’un tronçon</w:t>
+            </w:r>
+            <w:r>
+              <w:rPr>
+                <w:webHidden/>
+              </w:rPr>
+              <w:tab/>
+            </w:r>
+            <w:r>
+              <w:rPr>
+                <w:webHidden/>
+              </w:rPr>
+              <w:fldChar w:fldCharType="begin"/>
+            </w:r>
+            <w:r>
+              <w:rPr>
+                <w:webHidden/>
+              </w:rPr>
+              <w:instrText xml:space="preserve"> PAGEREF _Toc212728914 \h </w:instrText>
             </w:r>
             <w:r>
               <w:rPr>
@@ -1698,12 +1773,15 @@
     <w:p/>
     <w:p/>
     <w:p/>
+    <w:p/>
+    <w:p/>
     <w:p>
       <w:pPr>
         <w:pStyle w:val="Titre1"/>
       </w:pPr>
-      <w:bookmarkStart w:id="0" w:name="_Toc161956522"/>
-      <w:r>
+      <w:bookmarkStart w:id="0" w:name="_Toc212728909"/>
+      <w:r>
+        <w:lastRenderedPageBreak/>
         <w:t>Prérequis</w:t>
       </w:r>
       <w:bookmarkEnd w:id="0"/>
@@ -1733,7 +1811,7 @@
       <w:pPr>
         <w:pStyle w:val="Titre1"/>
       </w:pPr>
-      <w:bookmarkStart w:id="1" w:name="_Toc161956523"/>
+      <w:bookmarkStart w:id="1" w:name="_Toc212728910"/>
       <w:r>
         <w:t>Résumé</w:t>
       </w:r>
@@ -1756,7 +1834,7 @@
       <w:pPr>
         <w:pStyle w:val="Titre1"/>
       </w:pPr>
-      <w:bookmarkStart w:id="2" w:name="_Toc161956524"/>
+      <w:bookmarkStart w:id="2" w:name="_Toc212728911"/>
       <w:r>
         <w:t>Installation</w:t>
       </w:r>
@@ -1845,16 +1923,12 @@
     <w:p/>
     <w:p/>
     <w:p/>
-    <w:p/>
-    <w:p/>
-    <w:p/>
     <w:p>
       <w:pPr>
         <w:pStyle w:val="Titre1"/>
       </w:pPr>
-      <w:bookmarkStart w:id="3" w:name="_Toc161956525"/>
-      <w:r>
-        <w:lastRenderedPageBreak/>
+      <w:bookmarkStart w:id="3" w:name="_Toc212728912"/>
+      <w:r>
         <w:t>Présentation</w:t>
       </w:r>
       <w:bookmarkEnd w:id="3"/>
@@ -2202,11 +2276,6 @@
       </w:r>
     </w:p>
     <w:p/>
-    <w:p/>
-    <w:p/>
-    <w:p/>
-    <w:p/>
-    <w:p/>
     <w:p>
       <w:pPr>
         <w:pStyle w:val="Titre1"/>
@@ -2217,7 +2286,7 @@
       <w:bookmarkStart w:id="7" w:name="_Toc223756091"/>
       <w:bookmarkStart w:id="8" w:name="_Toc223425647"/>
       <w:bookmarkStart w:id="9" w:name="_Toc223756092"/>
-      <w:bookmarkStart w:id="10" w:name="_Toc161956526"/>
+      <w:bookmarkStart w:id="10" w:name="_Toc212728913"/>
       <w:bookmarkStart w:id="11" w:name="_Toc215049623"/>
       <w:bookmarkEnd w:id="4"/>
       <w:bookmarkEnd w:id="5"/>
@@ -2238,6 +2307,10 @@
     <w:p>
       <w:pPr>
         <w:ind w:left="360"/>
+        <w:rPr>
+          <w:b/>
+          <w:bCs/>
+        </w:rPr>
       </w:pPr>
       <w:r>
         <w:rPr>
@@ -2246,7 +2319,59 @@
         <w:t>IMPORTANT</w:t>
       </w:r>
       <w:r>
-        <w:t xml:space="preserve"> : il faut </w:t>
+        <w:t> :</w:t>
+      </w:r>
+      <w:r>
+        <w:t xml:space="preserve"> Ce plugin a été développé pour être utilisé avec les guichets </w:t>
+      </w:r>
+      <w:r>
+        <w:rPr>
+          <w:b/>
+          <w:bCs/>
+        </w:rPr>
+        <w:t>Inventaires hydrographiques de l’Etat</w:t>
+      </w:r>
+      <w:r>
+        <w:t xml:space="preserve"> et </w:t>
+      </w:r>
+      <w:r>
+        <w:rPr>
+          <w:b/>
+          <w:bCs/>
+        </w:rPr>
+        <w:t xml:space="preserve">Inventaires hydrographiques de l’Etat </w:t>
+      </w:r>
+      <w:r>
+        <w:rPr>
+          <w:b/>
+          <w:bCs/>
+        </w:rPr>
+        <w:t>–</w:t>
+      </w:r>
+      <w:r>
+        <w:rPr>
+          <w:b/>
+          <w:bCs/>
+        </w:rPr>
+        <w:t xml:space="preserve"> FORMATION</w:t>
+      </w:r>
+      <w:r>
+        <w:rPr>
+          <w:b/>
+          <w:bCs/>
+        </w:rPr>
+        <w:t>.</w:t>
+      </w:r>
+    </w:p>
+    <w:p>
+      <w:pPr>
+        <w:ind w:left="360"/>
+      </w:pPr>
+      <w:r>
+        <w:t>I</w:t>
+      </w:r>
+      <w:r>
+        <w:t xml:space="preserve">l faut </w:t>
       </w:r>
       <w:r>
         <w:t>impérativement</w:t>
@@ -2261,7 +2386,31 @@
         <w:t xml:space="preserve"> connecté </w:t>
       </w:r>
       <w:r>
-        <w:t>à l’espace collaboratif avant l’utilisation du plugin ou juste après une validation lorsque QGIS demande de vous connecter si ce n’est pas déjà fait</w:t>
+        <w:t xml:space="preserve">à l’espace collaboratif </w:t>
+      </w:r>
+      <w:r>
+        <w:t xml:space="preserve">dans un des 2 groupes et avoir chargé les couches de ce groupe </w:t>
+      </w:r>
+      <w:r>
+        <w:t xml:space="preserve">avant l’utilisation du </w:t>
+      </w:r>
+      <w:r>
+        <w:t>plugin. Il</w:t>
+      </w:r>
+      <w:r>
+        <w:t xml:space="preserve"> est encore possible </w:t>
+      </w:r>
+      <w:r>
+        <w:t xml:space="preserve">de se connecter </w:t>
+      </w:r>
+      <w:r>
+        <w:t xml:space="preserve">juste après une validation lorsque QGIS </w:t>
+      </w:r>
+      <w:r>
+        <w:t xml:space="preserve">le </w:t>
+      </w:r>
+      <w:r>
+        <w:t>demande si ce n’est pas déjà fait</w:t>
       </w:r>
       <w:r>
         <w:t xml:space="preserve"> s</w:t>
@@ -2281,6 +2430,11 @@
       <w:r>
         <w:t>effectives dans l’espace collaboratif.</w:t>
       </w:r>
+    </w:p>
+    <w:p>
+      <w:pPr>
+        <w:ind w:left="360"/>
+      </w:pPr>
     </w:p>
     <w:p>
       <w:pPr>
@@ -2390,6 +2544,43 @@
     </w:p>
     <w:p>
       <w:pPr>
+        <w:pStyle w:val="Titre1"/>
+      </w:pPr>
+      <w:bookmarkStart w:id="12" w:name="_Toc212728914"/>
+      <w:r>
+        <w:t>Exemple de manipulation : je veux modifier la nature d’un tronçon</w:t>
+      </w:r>
+      <w:bookmarkEnd w:id="12"/>
+    </w:p>
+    <w:p/>
+    <w:p>
+      <w:pPr>
+        <w:ind w:left="360"/>
+      </w:pPr>
+      <w:r>
+        <w:t>Je veux modifier la nature d’un tronçon de Ecoulement naturel en Canal</w:t>
+      </w:r>
+    </w:p>
+    <w:p>
+      <w:pPr>
+        <w:pStyle w:val="Paragraphedeliste"/>
+        <w:numPr>
+          <w:ilvl w:val="0"/>
+          <w:numId w:val="49"/>
+        </w:numPr>
+      </w:pPr>
+      <w:r>
+        <w:t xml:space="preserve">Je </w:t>
+      </w:r>
+      <w:r>
+        <w:t>s</w:t>
+      </w:r>
+      <w:r>
+        <w:t>électionne le tronçon à modifier. Les valeurs de ses attributs s’affichent en vert dans l’outil.</w:t>
+      </w:r>
+    </w:p>
+    <w:p>
+      <w:pPr>
         <w:ind w:left="360"/>
         <w:jc w:val="center"/>
       </w:pPr>
@@ -2398,9 +2589,9 @@
           <w:noProof/>
         </w:rPr>
         <w:drawing>
-          <wp:inline distT="0" distB="0" distL="0" distR="0" wp14:anchorId="1BB604BC" wp14:editId="225977F9">
-            <wp:extent cx="3734321" cy="4639322"/>
-            <wp:effectExtent l="0" t="0" r="0" b="8890"/>
+          <wp:inline distT="0" distB="0" distL="0" distR="0" wp14:anchorId="1BB604BC" wp14:editId="61D57684">
+            <wp:extent cx="2505075" cy="3112172"/>
+            <wp:effectExtent l="0" t="0" r="0" b="0"/>
             <wp:docPr id="11" name="Image 11"/>
             <wp:cNvGraphicFramePr>
               <a:graphicFrameLocks xmlns:a="http://schemas.openxmlformats.org/drawingml/2006/main" noChangeAspect="1"/>
@@ -2427,7 +2618,7 @@
                   <pic:spPr>
                     <a:xfrm>
                       <a:off x="0" y="0"/>
-                      <a:ext cx="3734321" cy="4639322"/>
+                      <a:ext cx="2511523" cy="3120183"/>
                     </a:xfrm>
                     <a:prstGeom prst="rect">
                       <a:avLst/>
@@ -2443,35 +2634,79 @@
     <w:p>
       <w:pPr>
         <w:ind w:left="360"/>
+        <w:jc w:val="center"/>
       </w:pPr>
     </w:p>
     <w:p>
       <w:pPr>
+        <w:pStyle w:val="Paragraphedeliste"/>
+        <w:numPr>
+          <w:ilvl w:val="0"/>
+          <w:numId w:val="49"/>
+        </w:numPr>
         <w:spacing w:before="0" w:after="200" w:line="276" w:lineRule="auto"/>
         <w:jc w:val="left"/>
       </w:pPr>
       <w:r>
-        <w:br w:type="page"/>
+        <w:t>Je clique sur la valeur Ecoulement naturel pour dérouler les valeurs possibles</w:t>
       </w:r>
     </w:p>
     <w:p>
       <w:pPr>
-        <w:ind w:left="360"/>
+        <w:pStyle w:val="Paragraphedeliste"/>
+        <w:spacing w:before="0" w:after="200" w:line="276" w:lineRule="auto"/>
+        <w:jc w:val="left"/>
       </w:pPr>
     </w:p>
     <w:p>
       <w:pPr>
-        <w:ind w:left="360"/>
-      </w:pPr>
-      <w:r>
-        <w:t>Les valeurs d’attributs modifiés manuellement apparaissent en rose :</w:t>
-      </w:r>
+        <w:pStyle w:val="Paragraphedeliste"/>
+        <w:spacing w:before="0" w:after="200" w:line="276" w:lineRule="auto"/>
+        <w:jc w:val="left"/>
+      </w:pPr>
     </w:p>
-    <w:p/>
     <w:p>
       <w:pPr>
-        <w:ind w:left="360"/>
-      </w:pPr>
+        <w:pStyle w:val="Paragraphedeliste"/>
+        <w:spacing w:before="0" w:after="200" w:line="276" w:lineRule="auto"/>
+        <w:jc w:val="left"/>
+      </w:pPr>
+    </w:p>
+    <w:p>
+      <w:pPr>
+        <w:pStyle w:val="Paragraphedeliste"/>
+        <w:spacing w:before="0" w:after="200" w:line="276" w:lineRule="auto"/>
+        <w:jc w:val="left"/>
+      </w:pPr>
+    </w:p>
+    <w:p>
+      <w:pPr>
+        <w:pStyle w:val="Paragraphedeliste"/>
+        <w:spacing w:before="0" w:after="200" w:line="276" w:lineRule="auto"/>
+        <w:jc w:val="left"/>
+      </w:pPr>
+    </w:p>
+    <w:p>
+      <w:pPr>
+        <w:pStyle w:val="Paragraphedeliste"/>
+        <w:spacing w:before="0" w:after="200" w:line="276" w:lineRule="auto"/>
+        <w:jc w:val="left"/>
+      </w:pPr>
+    </w:p>
+    <w:p>
+      <w:pPr>
+        <w:pStyle w:val="Paragraphedeliste"/>
+        <w:numPr>
+          <w:ilvl w:val="0"/>
+          <w:numId w:val="49"/>
+        </w:numPr>
+        <w:spacing w:before="0" w:after="200" w:line="276" w:lineRule="auto"/>
+        <w:jc w:val="left"/>
+      </w:pPr>
+      <w:r>
+        <w:lastRenderedPageBreak/>
+        <w:t>Je choisis Canal. Cette valeur apparait sur fond rouge/rose tant que la modification n’est pas validée.</w:t>
+      </w:r>
     </w:p>
     <w:p>
       <w:pPr>
@@ -2488,8 +2723,8 @@
           <w:noProof/>
         </w:rPr>
         <w:drawing>
-          <wp:inline distT="0" distB="0" distL="0" distR="0" wp14:anchorId="27544B41" wp14:editId="6E9D1B4A">
-            <wp:extent cx="3734321" cy="4639322"/>
+          <wp:inline distT="0" distB="0" distL="0" distR="0" wp14:anchorId="27544B41" wp14:editId="2CFDEB35">
+            <wp:extent cx="2324100" cy="2887338"/>
             <wp:effectExtent l="0" t="0" r="0" b="8890"/>
             <wp:docPr id="20" name="Image 20"/>
             <wp:cNvGraphicFramePr>
@@ -2517,7 +2752,7 @@
                   <pic:spPr>
                     <a:xfrm>
                       <a:off x="0" y="0"/>
-                      <a:ext cx="3734321" cy="4639322"/>
+                      <a:ext cx="2333714" cy="2899282"/>
                     </a:xfrm>
                     <a:prstGeom prst="rect">
                       <a:avLst/>
@@ -2537,10 +2772,17 @@
     </w:p>
     <w:p>
       <w:pPr>
-        <w:ind w:left="360"/>
-      </w:pPr>
-      <w:r>
-        <w:t xml:space="preserve">Cliquer sur : </w:t>
+        <w:pStyle w:val="Paragraphedeliste"/>
+        <w:numPr>
+          <w:ilvl w:val="0"/>
+          <w:numId w:val="49"/>
+        </w:numPr>
+      </w:pPr>
+      <w:r>
+        <w:t>Je clique sur :</w:t>
+      </w:r>
+      <w:r>
+        <w:t xml:space="preserve"> </w:t>
       </w:r>
       <w:r>
         <w:rPr>
@@ -2594,30 +2836,28 @@
     </w:p>
     <w:p>
       <w:pPr>
-        <w:ind w:left="360"/>
-      </w:pPr>
-      <w:r>
-        <w:t>Vous pouvez ainsi modifier autant de tronçons que vous désirez.</w:t>
+        <w:ind w:firstLine="360"/>
+      </w:pPr>
+      <w:r>
+        <w:rPr>
+          <w:noProof/>
+        </w:rPr>
+        <w:t xml:space="preserve"> </w:t>
+      </w:r>
+      <w:r>
+        <w:t>Un message QGIS confirme la prise en compte des modifications.</w:t>
       </w:r>
     </w:p>
     <w:p>
       <w:pPr>
-        <w:ind w:firstLine="360"/>
-      </w:pPr>
-      <w:r>
-        <w:t>Un message QGIS confirme la prise en compte des modifications.</w:t>
-      </w:r>
-    </w:p>
-    <w:p>
-      <w:pPr>
-        <w:ind w:firstLine="360"/>
+        <w:pStyle w:val="Paragraphedeliste"/>
       </w:pPr>
       <w:r>
         <w:rPr>
           <w:noProof/>
         </w:rPr>
         <w:drawing>
-          <wp:inline distT="0" distB="0" distL="0" distR="0" wp14:anchorId="5603EE0A" wp14:editId="6FCFD4B7">
+          <wp:inline distT="0" distB="0" distL="0" distR="0" wp14:anchorId="1275A66F" wp14:editId="467E9EA1">
             <wp:extent cx="4324350" cy="323850"/>
             <wp:effectExtent l="0" t="0" r="0" b="0"/>
             <wp:docPr id="24" name="Image 24"/>
@@ -2655,30 +2895,26 @@
     </w:p>
     <w:p>
       <w:pPr>
-        <w:ind w:left="360"/>
+        <w:pStyle w:val="Paragraphedeliste"/>
       </w:pPr>
     </w:p>
     <w:p>
       <w:pPr>
-        <w:ind w:left="360"/>
-      </w:pPr>
-      <w:r>
-        <w:t xml:space="preserve">Pour enregistrer les modifications dans la base </w:t>
-      </w:r>
-      <w:proofErr w:type="spellStart"/>
-      <w:r>
-        <w:t>BDUni</w:t>
-      </w:r>
-      <w:proofErr w:type="spellEnd"/>
-      <w:r>
-        <w:t xml:space="preserve"> de l’IGN il faut cliquer sur  </w:t>
+        <w:pStyle w:val="Paragraphedeliste"/>
+        <w:numPr>
+          <w:ilvl w:val="0"/>
+          <w:numId w:val="49"/>
+        </w:numPr>
+      </w:pPr>
+      <w:r>
+        <w:t xml:space="preserve">J’enregistre les modifications de la couche en cliquant sur </w:t>
       </w:r>
       <w:r>
         <w:rPr>
           <w:noProof/>
         </w:rPr>
         <w:drawing>
-          <wp:inline distT="0" distB="0" distL="0" distR="0" wp14:anchorId="55DB3E9D" wp14:editId="2F4CD6BF">
+          <wp:inline distT="0" distB="0" distL="0" distR="0" wp14:anchorId="4E9642B0" wp14:editId="758942C2">
             <wp:extent cx="257211" cy="266737"/>
             <wp:effectExtent l="0" t="0" r="9525" b="0"/>
             <wp:docPr id="22" name="Image 22"/>
@@ -2719,16 +2955,30 @@
           </wp:inline>
         </w:drawing>
       </w:r>
+      <w:r>
+        <w:t xml:space="preserve"> dans la barre d’outils de QGis</w:t>
+      </w:r>
     </w:p>
     <w:p>
       <w:pPr>
         <w:ind w:left="360"/>
+      </w:pPr>
+    </w:p>
+    <w:p>
+      <w:pPr>
+        <w:ind w:left="360" w:firstLine="348"/>
       </w:pPr>
       <w:r>
         <w:rPr>
           <w:highlight w:val="yellow"/>
         </w:rPr>
-        <w:t>Attention :</w:t>
+        <w:t>A</w:t>
+      </w:r>
+      <w:r>
+        <w:rPr>
+          <w:highlight w:val="yellow"/>
+        </w:rPr>
+        <w:t>ttention :</w:t>
       </w:r>
       <w:r>
         <w:t xml:space="preserve">  ne pas confondre avec le bouton d’enregistrement du projet : </w:t>
@@ -3408,7 +3658,7 @@
         <v:path o:extrusionok="f" gradientshapeok="t" o:connecttype="rect"/>
         <o:lock v:ext="edit" aspectratio="t"/>
       </v:shapetype>
-      <v:shape id="_x0000_i1086" type="#_x0000_t75" style="width:30.75pt;height:52.35pt" o:bullet="t">
+      <v:shape id="_x0000_i1041" type="#_x0000_t75" style="width:30.75pt;height:52.5pt" o:bullet="t">
         <v:imagedata r:id="rId1" o:title="puce"/>
       </v:shape>
     </w:pict>
@@ -6118,6 +6368,95 @@
     </w:lvl>
   </w:abstractNum>
   <w:abstractNum w:abstractNumId="28" w15:restartNumberingAfterBreak="0">
+    <w:nsid w:val="6BE74CB6"/>
+    <w:multiLevelType w:val="hybridMultilevel"/>
+    <w:tmpl w:val="77F2DCEA"/>
+    <w:lvl w:ilvl="0" w:tplc="040C000F">
+      <w:start w:val="1"/>
+      <w:numFmt w:val="decimal"/>
+      <w:lvlText w:val="%1."/>
+      <w:lvlJc w:val="left"/>
+      <w:pPr>
+        <w:ind w:left="720" w:hanging="360"/>
+      </w:pPr>
+      <w:rPr>
+        <w:rFonts w:hint="default"/>
+      </w:rPr>
+    </w:lvl>
+    <w:lvl w:ilvl="1" w:tplc="040C0019" w:tentative="1">
+      <w:start w:val="1"/>
+      <w:numFmt w:val="lowerLetter"/>
+      <w:lvlText w:val="%2."/>
+      <w:lvlJc w:val="left"/>
+      <w:pPr>
+        <w:ind w:left="1440" w:hanging="360"/>
+      </w:pPr>
+    </w:lvl>
+    <w:lvl w:ilvl="2" w:tplc="040C001B" w:tentative="1">
+      <w:start w:val="1"/>
+      <w:numFmt w:val="lowerRoman"/>
+      <w:lvlText w:val="%3."/>
+      <w:lvlJc w:val="right"/>
+      <w:pPr>
+        <w:ind w:left="2160" w:hanging="180"/>
+      </w:pPr>
+    </w:lvl>
+    <w:lvl w:ilvl="3" w:tplc="040C000F" w:tentative="1">
+      <w:start w:val="1"/>
+      <w:numFmt w:val="decimal"/>
+      <w:lvlText w:val="%4."/>
+      <w:lvlJc w:val="left"/>
+      <w:pPr>
+        <w:ind w:left="2880" w:hanging="360"/>
+      </w:pPr>
+    </w:lvl>
+    <w:lvl w:ilvl="4" w:tplc="040C0019" w:tentative="1">
+      <w:start w:val="1"/>
+      <w:numFmt w:val="lowerLetter"/>
+      <w:lvlText w:val="%5."/>
+      <w:lvlJc w:val="left"/>
+      <w:pPr>
+        <w:ind w:left="3600" w:hanging="360"/>
+      </w:pPr>
+    </w:lvl>
+    <w:lvl w:ilvl="5" w:tplc="040C001B" w:tentative="1">
+      <w:start w:val="1"/>
+      <w:numFmt w:val="lowerRoman"/>
+      <w:lvlText w:val="%6."/>
+      <w:lvlJc w:val="right"/>
+      <w:pPr>
+        <w:ind w:left="4320" w:hanging="180"/>
+      </w:pPr>
+    </w:lvl>
+    <w:lvl w:ilvl="6" w:tplc="040C000F" w:tentative="1">
+      <w:start w:val="1"/>
+      <w:numFmt w:val="decimal"/>
+      <w:lvlText w:val="%7."/>
+      <w:lvlJc w:val="left"/>
+      <w:pPr>
+        <w:ind w:left="5040" w:hanging="360"/>
+      </w:pPr>
+    </w:lvl>
+    <w:lvl w:ilvl="7" w:tplc="040C0019" w:tentative="1">
+      <w:start w:val="1"/>
+      <w:numFmt w:val="lowerLetter"/>
+      <w:lvlText w:val="%8."/>
+      <w:lvlJc w:val="left"/>
+      <w:pPr>
+        <w:ind w:left="5760" w:hanging="360"/>
+      </w:pPr>
+    </w:lvl>
+    <w:lvl w:ilvl="8" w:tplc="040C001B" w:tentative="1">
+      <w:start w:val="1"/>
+      <w:numFmt w:val="lowerRoman"/>
+      <w:lvlText w:val="%9."/>
+      <w:lvlJc w:val="right"/>
+      <w:pPr>
+        <w:ind w:left="6480" w:hanging="180"/>
+      </w:pPr>
+    </w:lvl>
+  </w:abstractNum>
+  <w:abstractNum w:abstractNumId="29" w15:restartNumberingAfterBreak="0">
     <w:nsid w:val="7379389B"/>
     <w:multiLevelType w:val="hybridMultilevel"/>
     <w:tmpl w:val="4702A67E"/>
@@ -6259,7 +6598,7 @@
       </w:rPr>
     </w:lvl>
   </w:abstractNum>
-  <w:abstractNum w:abstractNumId="29" w15:restartNumberingAfterBreak="0">
+  <w:abstractNum w:abstractNumId="30" w15:restartNumberingAfterBreak="0">
     <w:nsid w:val="7F1A4E6B"/>
     <w:multiLevelType w:val="hybridMultilevel"/>
     <w:tmpl w:val="59744A7E"/>
@@ -6375,7 +6714,7 @@
     </w:lvl>
   </w:abstractNum>
   <w:num w:numId="1">
-    <w:abstractNumId w:val="28"/>
+    <w:abstractNumId w:val="29"/>
   </w:num>
   <w:num w:numId="2">
     <w:abstractNumId w:val="6"/>
@@ -6396,7 +6735,7 @@
     <w:abstractNumId w:val="10"/>
   </w:num>
   <w:num w:numId="8">
-    <w:abstractNumId w:val="29"/>
+    <w:abstractNumId w:val="30"/>
   </w:num>
   <w:num w:numId="9">
     <w:abstractNumId w:val="27"/>
@@ -6517,6 +6856,9 @@
   </w:num>
   <w:num w:numId="48">
     <w:abstractNumId w:val="18"/>
+  </w:num>
+  <w:num w:numId="49">
+    <w:abstractNumId w:val="28"/>
   </w:num>
 </w:numbering>
 </file>
@@ -8341,11 +8683,13 @@
     <w:rsid w:val="000B22EE"/>
     <w:rsid w:val="000D4DEE"/>
     <w:rsid w:val="00162DC9"/>
+    <w:rsid w:val="001B053E"/>
     <w:rsid w:val="003259A4"/>
     <w:rsid w:val="0032743B"/>
     <w:rsid w:val="00515A60"/>
     <w:rsid w:val="0054019A"/>
     <w:rsid w:val="00596E3A"/>
+    <w:rsid w:val="00604BDA"/>
     <w:rsid w:val="00660988"/>
     <w:rsid w:val="00686ACC"/>
     <w:rsid w:val="006C3956"/>
@@ -9137,6 +9481,29 @@
 </file>
 
 <file path=customXml/item1.xml><?xml version="1.0" encoding="utf-8"?>
+<b:Sources xmlns:b="http://schemas.openxmlformats.org/officeDocument/2006/bibliography" xmlns="http://schemas.openxmlformats.org/officeDocument/2006/bibliography" SelectedStyle="\APA.XSL" StyleName="APA"/>
+</file>
+
+<file path=customXml/item2.xml><?xml version="1.0" encoding="utf-8"?>
+<?mso-contentType ?>
+<FormTemplates xmlns="http://schemas.microsoft.com/sharepoint/v3/contenttype/forms">
+  <Display>DocumentLibraryForm</Display>
+  <Edit>DocumentLibraryForm</Edit>
+  <New>DocumentLibraryForm</New>
+</FormTemplates>
+</file>
+
+<file path=customXml/item3.xml><?xml version="1.0" encoding="utf-8"?>
+<p:properties xmlns:p="http://schemas.microsoft.com/office/2006/metadata/properties" xmlns:xsi="http://www.w3.org/2001/XMLSchema-instance" xmlns:pc="http://schemas.microsoft.com/office/infopath/2007/PartnerControls">
+  <documentManagement>
+    <lcf76f155ced4ddcb4097134ff3c332f xmlns="b295003c-aa87-407e-9024-fdee4e88f6fa">
+      <Terms xmlns="http://schemas.microsoft.com/office/infopath/2007/PartnerControls"/>
+    </lcf76f155ced4ddcb4097134ff3c332f>
+  </documentManagement>
+</p:properties>
+</file>
+
+<file path=customXml/item4.xml><?xml version="1.0" encoding="utf-8"?>
 <ct:contentTypeSchema xmlns:ct="http://schemas.microsoft.com/office/2006/metadata/contentType" xmlns:ma="http://schemas.microsoft.com/office/2006/metadata/properties/metaAttributes" ct:_="" ma:_="" ma:contentTypeName="Document" ma:contentTypeID="0x010100A3FA4CB5114F4B43B99F0B6DC8751D90" ma:contentTypeVersion="10" ma:contentTypeDescription="Crée un document." ma:contentTypeScope="" ma:versionID="501205be520febb413c56432ff8e6df1">
   <xsd:schema xmlns:xsd="http://www.w3.org/2001/XMLSchema" xmlns:xs="http://www.w3.org/2001/XMLSchema" xmlns:p="http://schemas.microsoft.com/office/2006/metadata/properties" xmlns:ns2="b295003c-aa87-407e-9024-fdee4e88f6fa" targetNamespace="http://schemas.microsoft.com/office/2006/metadata/properties" ma:root="true" ma:fieldsID="0378f5bf275aa5e8e5bb75b38d3da7db" ns2:_="">
     <xsd:import namespace="b295003c-aa87-407e-9024-fdee4e88f6fa"/>
@@ -9314,30 +9681,33 @@
 </ct:contentTypeSchema>
 </file>
 
-<file path=customXml/item2.xml><?xml version="1.0" encoding="utf-8"?>
-<b:Sources xmlns:b="http://schemas.openxmlformats.org/officeDocument/2006/bibliography" xmlns="http://schemas.openxmlformats.org/officeDocument/2006/bibliography" SelectedStyle="\APA.XSL" StyleName="APA"/>
+<file path=customXml/itemProps1.xml><?xml version="1.0" encoding="utf-8"?>
+<ds:datastoreItem xmlns:ds="http://schemas.openxmlformats.org/officeDocument/2006/customXml" ds:itemID="{0FF0F878-5F0F-460C-9013-40E72731A637}">
+  <ds:schemaRefs>
+    <ds:schemaRef ds:uri="http://schemas.openxmlformats.org/officeDocument/2006/bibliography"/>
+  </ds:schemaRefs>
+</ds:datastoreItem>
 </file>
 
-<file path=customXml/item3.xml><?xml version="1.0" encoding="utf-8"?>
-<?mso-contentType ?>
-<FormTemplates xmlns="http://schemas.microsoft.com/sharepoint/v3/contenttype/forms">
-  <Display>DocumentLibraryForm</Display>
-  <Edit>DocumentLibraryForm</Edit>
-  <New>DocumentLibraryForm</New>
-</FormTemplates>
+<file path=customXml/itemProps2.xml><?xml version="1.0" encoding="utf-8"?>
+<ds:datastoreItem xmlns:ds="http://schemas.openxmlformats.org/officeDocument/2006/customXml" ds:itemID="{EEE2973D-7DD7-4773-855D-5CAD81242BDE}">
+  <ds:schemaRefs>
+    <ds:schemaRef ds:uri="http://schemas.microsoft.com/sharepoint/v3/contenttype/forms"/>
+  </ds:schemaRefs>
+</ds:datastoreItem>
 </file>
 
-<file path=customXml/item4.xml><?xml version="1.0" encoding="utf-8"?>
-<p:properties xmlns:p="http://schemas.microsoft.com/office/2006/metadata/properties" xmlns:xsi="http://www.w3.org/2001/XMLSchema-instance" xmlns:pc="http://schemas.microsoft.com/office/infopath/2007/PartnerControls">
-  <documentManagement>
-    <lcf76f155ced4ddcb4097134ff3c332f xmlns="b295003c-aa87-407e-9024-fdee4e88f6fa">
-      <Terms xmlns="http://schemas.microsoft.com/office/infopath/2007/PartnerControls"/>
-    </lcf76f155ced4ddcb4097134ff3c332f>
-  </documentManagement>
-</p:properties>
+<file path=customXml/itemProps3.xml><?xml version="1.0" encoding="utf-8"?>
+<ds:datastoreItem xmlns:ds="http://schemas.openxmlformats.org/officeDocument/2006/customXml" ds:itemID="{1159403A-C237-488E-8C5E-DABF9FCE7043}">
+  <ds:schemaRefs>
+    <ds:schemaRef ds:uri="http://schemas.microsoft.com/office/2006/metadata/properties"/>
+    <ds:schemaRef ds:uri="http://schemas.microsoft.com/office/infopath/2007/PartnerControls"/>
+    <ds:schemaRef ds:uri="b295003c-aa87-407e-9024-fdee4e88f6fa"/>
+  </ds:schemaRefs>
+</ds:datastoreItem>
 </file>
 
-<file path=customXml/itemProps1.xml><?xml version="1.0" encoding="utf-8"?>
+<file path=customXml/itemProps4.xml><?xml version="1.0" encoding="utf-8"?>
 <ds:datastoreItem xmlns:ds="http://schemas.openxmlformats.org/officeDocument/2006/customXml" ds:itemID="{15B44F83-286F-41C1-A87D-D9F5E51288E0}">
   <ds:schemaRefs>
     <ds:schemaRef ds:uri="http://schemas.microsoft.com/office/2006/metadata/contentType"/>
@@ -9353,30 +9723,4 @@
     <ds:schemaRef ds:uri="http://schemas.microsoft.com/internal/obd"/>
   </ds:schemaRefs>
 </ds:datastoreItem>
-</file>
-
-<file path=customXml/itemProps2.xml><?xml version="1.0" encoding="utf-8"?>
-<ds:datastoreItem xmlns:ds="http://schemas.openxmlformats.org/officeDocument/2006/customXml" ds:itemID="{0FF0F878-5F0F-460C-9013-40E72731A637}">
-  <ds:schemaRefs>
-    <ds:schemaRef ds:uri="http://schemas.openxmlformats.org/officeDocument/2006/bibliography"/>
-  </ds:schemaRefs>
-</ds:datastoreItem>
-</file>
-
-<file path=customXml/itemProps3.xml><?xml version="1.0" encoding="utf-8"?>
-<ds:datastoreItem xmlns:ds="http://schemas.openxmlformats.org/officeDocument/2006/customXml" ds:itemID="{EEE2973D-7DD7-4773-855D-5CAD81242BDE}">
-  <ds:schemaRefs>
-    <ds:schemaRef ds:uri="http://schemas.microsoft.com/sharepoint/v3/contenttype/forms"/>
-  </ds:schemaRefs>
-</ds:datastoreItem>
-</file>
-
-<file path=customXml/itemProps4.xml><?xml version="1.0" encoding="utf-8"?>
-<ds:datastoreItem xmlns:ds="http://schemas.openxmlformats.org/officeDocument/2006/customXml" ds:itemID="{1159403A-C237-488E-8C5E-DABF9FCE7043}">
-  <ds:schemaRefs>
-    <ds:schemaRef ds:uri="http://schemas.microsoft.com/office/2006/metadata/properties"/>
-    <ds:schemaRef ds:uri="http://schemas.microsoft.com/office/infopath/2007/PartnerControls"/>
-    <ds:schemaRef ds:uri="b295003c-aa87-407e-9024-fdee4e88f6fa"/>
-  </ds:schemaRefs>
-</ds:datastoreItem>
 </file>
</xml_diff>